<commit_message>
docs: add Zenodo DOI (10.5281/zenodo.22087936) to Data availability in paper_zh_ICUtransfer_v13.docx
</commit_message>
<xml_diff>
--- a/manuscript/paper_zh_ICUtransfer_v13.docx
+++ b/manuscript/paper_zh_ICUtransfer_v13.docx
@@ -2770,6 +2770,27 @@
     </w:p>
     <w:p>
       <w:pPr>
+        <w:pBdr>
+          <w:bottom w:val="single" w:sz="6" w:space="1" w:color="999999"/>
+        </w:pBdr>
+      </w:pPr>
+      <w:r>
+        <w:rPr>
+          <w:b/>
+        </w:rPr>
+        <w:t>数据可用性声明 Data Availability Statement</w:t>
+      </w:r>
+    </w:p>
+    <w:p>
+      <w:r>
+        <w:rPr>
+          <w:b w:val="0"/>
+        </w:rPr>
+        <w:t>MIMIC-IV、INSPIRE 与 eICU 在 PhysioNet 注册并签署数据使用协议后公开获取。本研究的本地数据集因机构隐私规定不予公开，但可向通讯作者合理请求获取。去标识化衍生队列、分析代码及中英双语网页计算器已存档并公开于 Zenodo（https://doi.org/10.5281/zenodo.22087936），在线计算器地址：https://morrosun.github.io/ortho-gnri-nlr-icu-transfer/。</w:t>
+      </w:r>
+    </w:p>
+    <w:p>
+      <w:pPr>
         <w:spacing w:line="288" w:lineRule="auto" w:after="60"/>
       </w:pPr>
       <w:r>

</xml_diff>

<commit_message>
docs: replace Figure 1 with clean, non-overlapping version in paper_zh_ICUtransfer_v13.docx
</commit_message>
<xml_diff>
--- a/manuscript/paper_zh_ICUtransfer_v13.docx
+++ b/manuscript/paper_zh_ICUtransfer_v13.docx
@@ -379,7 +379,7 @@
       <w:r>
         <w:drawing>
           <wp:inline xmlns:a="http://schemas.openxmlformats.org/drawingml/2006/main" xmlns:pic="http://schemas.openxmlformats.org/drawingml/2006/picture">
-            <wp:extent cx="5171707" cy="3390206"/>
+            <wp:extent cx="5171707" cy="3655957"/>
             <wp:docPr id="1" name="Picture 1"/>
             <wp:cNvGraphicFramePr>
               <a:graphicFrameLocks noChangeAspect="1"/>
@@ -400,7 +400,7 @@
                   <pic:spPr>
                     <a:xfrm>
                       <a:off x="0" y="0"/>
-                      <a:ext cx="5171707" cy="3390206"/>
+                      <a:ext cx="5171707" cy="3655957"/>
                     </a:xfrm>
                     <a:prstGeom prst="rect"/>
                   </pic:spPr>

</xml_diff>